<commit_message>
Make M06 artifacts reproducible and tighten audit key
Co-authored-by: shaseaver25 <shannon@tailoredu.org>
</commit_message>
<xml_diff>
--- a/teaching-pack/10-M06-alarm-audit/H6-01-FOREMAN-alarm-disposition.docx
+++ b/teaching-pack/10-M06-alarm-audit/H6-01-FOREMAN-alarm-disposition.docx
@@ -267,6 +267,47 @@
                 <w:i w:val="0"/>
                 <w:sz w:val="19"/>
               </w:rPr>
+              <w:t>Reference fit</w:t>
+            </w:r>
+          </w:p>
+        </w:tc>
+        <w:tc>
+          <w:tcPr>
+            <w:tcW w:type="dxa" w:w="7056"/>
+            <w:shd w:val="clear" w:color="auto" w:fill="F4F6F8"/>
+          </w:tcPr>
+          <w:p>
+            <w:pPr>
+              <w:spacing w:before="20" w:after="20" w:line="252" w:lineRule="auto"/>
+            </w:pPr>
+            <w:r>
+              <w:rPr>
+                <w:rFonts w:ascii="Barlow" w:hAnsi="Barlow" w:cs="Barlow"/>
+                <w:b w:val="0"/>
+                <w:i w:val="0"/>
+                <w:sz w:val="19"/>
+              </w:rPr>
+              <w:t>February 2–15 daily peaks; February 16 candidate held out</w:t>
+            </w:r>
+          </w:p>
+        </w:tc>
+      </w:tr>
+      <w:tr>
+        <w:tc>
+          <w:tcPr>
+            <w:tcW w:type="dxa" w:w="2880"/>
+          </w:tcPr>
+          <w:p>
+            <w:pPr>
+              <w:spacing w:before="20" w:after="20" w:line="252" w:lineRule="auto"/>
+            </w:pPr>
+            <w:r>
+              <w:rPr>
+                <w:rFonts w:ascii="Barlow" w:hAnsi="Barlow" w:cs="Barlow"/>
+                <w:b w:val="0"/>
+                <w:i w:val="0"/>
+                <w:sz w:val="19"/>
+              </w:rPr>
               <w:t>Model</w:t>
             </w:r>
           </w:p>
@@ -274,7 +315,6 @@
         <w:tc>
           <w:tcPr>
             <w:tcW w:type="dxa" w:w="7056"/>
-            <w:shd w:val="clear" w:color="auto" w:fill="F4F6F8"/>
           </w:tcPr>
           <w:p>
             <w:pPr>
@@ -296,6 +336,7 @@
         <w:tc>
           <w:tcPr>
             <w:tcW w:type="dxa" w:w="2880"/>
+            <w:shd w:val="clear" w:color="auto" w:fill="F4F6F8"/>
           </w:tcPr>
           <w:p>
             <w:pPr>
@@ -315,6 +356,7 @@
         <w:tc>
           <w:tcPr>
             <w:tcW w:type="dxa" w:w="7056"/>
+            <w:shd w:val="clear" w:color="auto" w:fill="F4F6F8"/>
           </w:tcPr>
           <w:p>
             <w:pPr>
@@ -336,7 +378,6 @@
         <w:tc>
           <w:tcPr>
             <w:tcW w:type="dxa" w:w="2880"/>
-            <w:shd w:val="clear" w:color="auto" w:fill="F4F6F8"/>
           </w:tcPr>
           <w:p>
             <w:pPr>
@@ -356,7 +397,6 @@
         <w:tc>
           <w:tcPr>
             <w:tcW w:type="dxa" w:w="7056"/>
-            <w:shd w:val="clear" w:color="auto" w:fill="F4F6F8"/>
           </w:tcPr>
           <w:p>
             <w:pPr>
@@ -378,6 +418,7 @@
         <w:tc>
           <w:tcPr>
             <w:tcW w:type="dxa" w:w="2880"/>
+            <w:shd w:val="clear" w:color="auto" w:fill="F4F6F8"/>
           </w:tcPr>
           <w:p>
             <w:pPr>
@@ -397,6 +438,7 @@
         <w:tc>
           <w:tcPr>
             <w:tcW w:type="dxa" w:w="7056"/>
+            <w:shd w:val="clear" w:color="auto" w:fill="F4F6F8"/>
           </w:tcPr>
           <w:p>
             <w:pPr>

</xml_diff>